<commit_message>
Updated Math for Computer Science PEA project to be in paragraph form.
</commit_message>
<xml_diff>
--- a/1stYear/Program_Solving_Reflection/PEA Project - Claude White.docx
+++ b/1stYear/Program_Solving_Reflection/PEA Project - Claude White.docx
@@ -63,6 +63,11 @@
       </w:r>
     </w:p>
     <w:p>
+      <w:pPr>
+        <w:rPr>
+          <w:lang w:val="fr-CA"/>
+        </w:rPr>
+      </w:pPr>
       <m:oMath>
         <m:r>
           <w:rPr>
@@ -71,30 +76,57 @@
           <m:t>Δ</m:t>
         </m:r>
       </m:oMath>
-      <w:r>
-        <w:t>y = y</w:t>
+      <w:proofErr w:type="gramStart"/>
+      <w:r>
+        <w:rPr>
+          <w:lang w:val="fr-CA"/>
+        </w:rPr>
+        <w:t>y</w:t>
+      </w:r>
+      <w:proofErr w:type="gramEnd"/>
+      <w:r>
+        <w:rPr>
+          <w:lang w:val="fr-CA"/>
+        </w:rPr>
+        <w:t xml:space="preserve"> = y</w:t>
       </w:r>
       <w:r>
         <w:rPr>
           <w:vertAlign w:val="subscript"/>
+          <w:lang w:val="fr-CA"/>
         </w:rPr>
         <w:t>1</w:t>
       </w:r>
       <w:r>
+        <w:rPr>
+          <w:lang w:val="fr-CA"/>
+        </w:rPr>
         <w:t xml:space="preserve"> - y</w:t>
       </w:r>
       <w:r>
         <w:rPr>
           <w:vertAlign w:val="subscript"/>
+          <w:lang w:val="fr-CA"/>
         </w:rPr>
         <w:t>0</w:t>
       </w:r>
       <w:r>
+        <w:rPr>
+          <w:lang w:val="fr-CA"/>
+        </w:rPr>
         <w:t xml:space="preserve"> = 22 - 18 = 4</w:t>
       </w:r>
     </w:p>
     <w:p>
-      <w:r>
+      <w:pPr>
+        <w:rPr>
+          <w:lang w:val="fr-CA"/>
+        </w:rPr>
+      </w:pPr>
+      <w:r>
+        <w:rPr>
+          <w:lang w:val="fr-CA"/>
+        </w:rPr>
         <w:t xml:space="preserve">M = </w:t>
       </w:r>
       <m:oMath>
@@ -106,6 +138,9 @@
         </m:r>
       </m:oMath>
       <w:r>
+        <w:rPr>
+          <w:lang w:val="fr-CA"/>
+        </w:rPr>
         <w:t xml:space="preserve">y / </w:t>
       </w:r>
       <m:oMath>
@@ -117,11 +152,22 @@
         </m:r>
       </m:oMath>
       <w:r>
+        <w:rPr>
+          <w:lang w:val="fr-CA"/>
+        </w:rPr>
         <w:t>x = 4 / 5 = 0.8</w:t>
       </w:r>
     </w:p>
     <w:p>
-      <w:r>
+      <w:pPr>
+        <w:rPr>
+          <w:lang w:val="fr-CA"/>
+        </w:rPr>
+      </w:pPr>
+      <w:r>
+        <w:rPr>
+          <w:lang w:val="fr-CA"/>
+        </w:rPr>
         <w:t>|</w:t>
       </w:r>
       <m:oMath>
@@ -133,6 +179,9 @@
         </m:r>
       </m:oMath>
       <w:r>
+        <w:rPr>
+          <w:lang w:val="fr-CA"/>
+        </w:rPr>
         <w:t>x| &gt; |</w:t>
       </w:r>
       <m:oMath>
@@ -144,6 +193,9 @@
         </m:r>
       </m:oMath>
       <w:r>
+        <w:rPr>
+          <w:lang w:val="fr-CA"/>
+        </w:rPr>
         <w:t>y| then define steps = |x| = 5</w:t>
       </w:r>
     </w:p>
@@ -158,7 +210,11 @@
         <w:t>p+1</w:t>
       </w:r>
       <w:r>
-        <w:t xml:space="preserve"> = 1 + x</w:t>
+        <w:t xml:space="preserve"> = 1 + </w:t>
+      </w:r>
+      <w:proofErr w:type="spellStart"/>
+      <w:r>
+        <w:t>x</w:t>
       </w:r>
       <w:r>
         <w:rPr>
@@ -166,6 +222,7 @@
         </w:rPr>
         <w:t>p</w:t>
       </w:r>
+      <w:proofErr w:type="spellEnd"/>
     </w:p>
     <w:p>
       <w:r>
@@ -179,7 +236,11 @@
         <w:t>p+1</w:t>
       </w:r>
       <w:r>
-        <w:t xml:space="preserve"> = M + y</w:t>
+        <w:t xml:space="preserve"> = M + </w:t>
+      </w:r>
+      <w:proofErr w:type="spellStart"/>
+      <w:r>
+        <w:t>y</w:t>
       </w:r>
       <w:r>
         <w:rPr>
@@ -187,6 +248,7 @@
         </w:rPr>
         <w:t>p</w:t>
       </w:r>
+      <w:proofErr w:type="spellEnd"/>
     </w:p>
     <w:tbl>
       <w:tblPr>
@@ -261,6 +323,7 @@
               </w:pBdr>
               <w:spacing w:line="240" w:lineRule="auto"/>
             </w:pPr>
+            <w:proofErr w:type="spellStart"/>
             <w:r>
               <w:t>x</w:t>
             </w:r>
@@ -270,6 +333,7 @@
               </w:rPr>
               <w:t>n</w:t>
             </w:r>
+            <w:proofErr w:type="spellEnd"/>
           </w:p>
         </w:tc>
         <w:tc>
@@ -295,6 +359,7 @@
               </w:pBdr>
               <w:spacing w:line="240" w:lineRule="auto"/>
             </w:pPr>
+            <w:proofErr w:type="spellStart"/>
             <w:r>
               <w:t>y</w:t>
             </w:r>
@@ -304,6 +369,7 @@
               </w:rPr>
               <w:t>n</w:t>
             </w:r>
+            <w:proofErr w:type="spellEnd"/>
           </w:p>
         </w:tc>
         <w:tc>
@@ -1063,13 +1129,32 @@
       </w:r>
     </w:p>
     <w:p>
-      <w:r>
+      <w:pPr>
+        <w:rPr>
+          <w:lang w:val="fr-CA"/>
+        </w:rPr>
+      </w:pPr>
+      <w:r>
+        <w:rPr>
+          <w:lang w:val="fr-CA"/>
+        </w:rPr>
         <w:lastRenderedPageBreak/>
         <w:t>2.</w:t>
       </w:r>
     </w:p>
-    <w:p/>
     <w:p>
+      <w:pPr>
+        <w:rPr>
+          <w:lang w:val="fr-CA"/>
+        </w:rPr>
+      </w:pPr>
+    </w:p>
+    <w:p>
+      <w:pPr>
+        <w:rPr>
+          <w:lang w:val="fr-CA"/>
+        </w:rPr>
+      </w:pPr>
       <m:oMath>
         <m:r>
           <w:rPr>
@@ -1078,29 +1163,53 @@
           <m:t>Δ</m:t>
         </m:r>
       </m:oMath>
-      <w:r>
-        <w:t>x = x</w:t>
+      <w:proofErr w:type="gramStart"/>
+      <w:r>
+        <w:rPr>
+          <w:lang w:val="fr-CA"/>
+        </w:rPr>
+        <w:t>x</w:t>
+      </w:r>
+      <w:proofErr w:type="gramEnd"/>
+      <w:r>
+        <w:rPr>
+          <w:lang w:val="fr-CA"/>
+        </w:rPr>
+        <w:t xml:space="preserve"> = x</w:t>
       </w:r>
       <w:r>
         <w:rPr>
           <w:vertAlign w:val="subscript"/>
+          <w:lang w:val="fr-CA"/>
         </w:rPr>
         <w:t>1</w:t>
       </w:r>
       <w:r>
+        <w:rPr>
+          <w:lang w:val="fr-CA"/>
+        </w:rPr>
         <w:t xml:space="preserve"> - x</w:t>
       </w:r>
       <w:r>
         <w:rPr>
           <w:vertAlign w:val="subscript"/>
+          <w:lang w:val="fr-CA"/>
         </w:rPr>
         <w:t>0</w:t>
       </w:r>
       <w:r>
+        <w:rPr>
+          <w:lang w:val="fr-CA"/>
+        </w:rPr>
         <w:t xml:space="preserve"> = 14 - 9 = 5</w:t>
       </w:r>
     </w:p>
     <w:p>
+      <w:pPr>
+        <w:rPr>
+          <w:lang w:val="fr-CA"/>
+        </w:rPr>
+      </w:pPr>
       <m:oMath>
         <m:r>
           <w:rPr>
@@ -1109,39 +1218,70 @@
           <m:t>Δ</m:t>
         </m:r>
       </m:oMath>
-      <w:r>
-        <w:t>y = y</w:t>
+      <w:proofErr w:type="gramStart"/>
+      <w:r>
+        <w:rPr>
+          <w:lang w:val="fr-CA"/>
+        </w:rPr>
+        <w:t>y</w:t>
+      </w:r>
+      <w:proofErr w:type="gramEnd"/>
+      <w:r>
+        <w:rPr>
+          <w:lang w:val="fr-CA"/>
+        </w:rPr>
+        <w:t xml:space="preserve"> = y</w:t>
       </w:r>
       <w:r>
         <w:rPr>
           <w:vertAlign w:val="subscript"/>
+          <w:lang w:val="fr-CA"/>
         </w:rPr>
         <w:t>1</w:t>
       </w:r>
       <w:r>
+        <w:rPr>
+          <w:lang w:val="fr-CA"/>
+        </w:rPr>
         <w:t xml:space="preserve"> - y</w:t>
       </w:r>
       <w:r>
         <w:rPr>
           <w:vertAlign w:val="subscript"/>
+          <w:lang w:val="fr-CA"/>
         </w:rPr>
         <w:t>0</w:t>
       </w:r>
       <w:r>
+        <w:rPr>
+          <w:lang w:val="fr-CA"/>
+        </w:rPr>
         <w:t xml:space="preserve"> = 22 - 18 = 4</w:t>
       </w:r>
     </w:p>
     <w:p>
-      <w:r>
+      <w:pPr>
+        <w:rPr>
+          <w:lang w:val="fr-CA"/>
+        </w:rPr>
+      </w:pPr>
+      <w:r>
+        <w:rPr>
+          <w:lang w:val="fr-CA"/>
+        </w:rPr>
         <w:t>P</w:t>
       </w:r>
       <w:r>
         <w:rPr>
           <w:vertAlign w:val="subscript"/>
+          <w:lang w:val="fr-CA"/>
         </w:rPr>
         <w:t>k</w:t>
       </w:r>
       <w:r>
+        <w:rPr>
+          <w:lang w:val="fr-CA"/>
+        </w:rPr>
         <w:t xml:space="preserve"> = 2</w:t>
       </w:r>
       <m:oMath>
@@ -1153,6 +1293,9 @@
         </m:r>
       </m:oMath>
       <w:r>
+        <w:rPr>
+          <w:lang w:val="fr-CA"/>
+        </w:rPr>
         <w:t xml:space="preserve">y - </w:t>
       </w:r>
       <m:oMath>
@@ -1164,38 +1307,61 @@
         </m:r>
       </m:oMath>
       <w:r>
+        <w:rPr>
+          <w:lang w:val="fr-CA"/>
+        </w:rPr>
         <w:t>x = 8 - 5 = 3</w:t>
       </w:r>
     </w:p>
     <w:p>
-      <w:r>
+      <w:pPr>
+        <w:rPr>
+          <w:lang w:val="fr-CA"/>
+        </w:rPr>
+      </w:pPr>
+      <w:r>
+        <w:rPr>
+          <w:lang w:val="fr-CA"/>
+        </w:rPr>
         <w:t>P</w:t>
       </w:r>
       <w:r>
         <w:rPr>
           <w:vertAlign w:val="subscript"/>
+          <w:lang w:val="fr-CA"/>
         </w:rPr>
         <w:t>k</w:t>
       </w:r>
       <w:r>
+        <w:rPr>
+          <w:lang w:val="fr-CA"/>
+        </w:rPr>
         <w:t xml:space="preserve"> &lt; 0 {P</w:t>
       </w:r>
       <w:r>
         <w:rPr>
           <w:vertAlign w:val="subscript"/>
+          <w:lang w:val="fr-CA"/>
         </w:rPr>
         <w:t>k + 1</w:t>
       </w:r>
       <w:r>
+        <w:rPr>
+          <w:lang w:val="fr-CA"/>
+        </w:rPr>
         <w:t xml:space="preserve"> = P</w:t>
       </w:r>
       <w:r>
         <w:rPr>
           <w:vertAlign w:val="subscript"/>
+          <w:lang w:val="fr-CA"/>
         </w:rPr>
         <w:t>k</w:t>
       </w:r>
       <w:r>
+        <w:rPr>
+          <w:lang w:val="fr-CA"/>
+        </w:rPr>
         <w:t xml:space="preserve"> + 2</w:t>
       </w:r>
       <m:oMath>
@@ -1207,98 +1373,194 @@
         </m:r>
       </m:oMath>
       <w:r>
+        <w:rPr>
+          <w:lang w:val="fr-CA"/>
+        </w:rPr>
         <w:t>y</w:t>
-      </w:r>
-    </w:p>
-    <w:p>
-      <w:r>
-        <w:t xml:space="preserve">         </w:t>
-      </w:r>
-      <w:r>
-        <w:rPr>
-          <w:vertAlign w:val="subscript"/>
-        </w:rPr>
-        <w:t xml:space="preserve"> </w:t>
-      </w:r>
-      <w:r>
-        <w:t xml:space="preserve"> {x</w:t>
-      </w:r>
-      <w:r>
-        <w:rPr>
-          <w:vertAlign w:val="subscript"/>
-        </w:rPr>
-        <w:t>k+1</w:t>
-      </w:r>
-      <w:r>
-        <w:t xml:space="preserve"> = 1 + x</w:t>
-      </w:r>
-      <w:r>
-        <w:rPr>
-          <w:vertAlign w:val="subscript"/>
-        </w:rPr>
-        <w:t>k</w:t>
       </w:r>
     </w:p>
     <w:p>
       <w:pPr>
         <w:rPr>
+          <w:lang w:val="fr-CA"/>
+        </w:rPr>
+      </w:pPr>
+      <w:r>
+        <w:rPr>
+          <w:lang w:val="fr-CA"/>
+        </w:rPr>
+        <w:t xml:space="preserve">         </w:t>
+      </w:r>
+      <w:r>
+        <w:rPr>
           <w:vertAlign w:val="subscript"/>
-        </w:rPr>
-      </w:pPr>
+          <w:lang w:val="fr-CA"/>
+        </w:rPr>
+        <w:t xml:space="preserve"> </w:t>
+      </w:r>
+      <w:r>
+        <w:rPr>
+          <w:lang w:val="fr-CA"/>
+        </w:rPr>
+        <w:t xml:space="preserve"> {</w:t>
+      </w:r>
+      <w:proofErr w:type="gramStart"/>
+      <w:r>
+        <w:rPr>
+          <w:lang w:val="fr-CA"/>
+        </w:rPr>
+        <w:t>x</w:t>
+      </w:r>
       <w:r>
         <w:rPr>
           <w:vertAlign w:val="subscript"/>
-        </w:rPr>
-        <w:t xml:space="preserve"> </w:t>
-      </w:r>
-      <w:r>
-        <w:t xml:space="preserve">          {y</w:t>
-      </w:r>
+          <w:lang w:val="fr-CA"/>
+        </w:rPr>
+        <w:t>k</w:t>
+      </w:r>
+      <w:proofErr w:type="gramEnd"/>
       <w:r>
         <w:rPr>
           <w:vertAlign w:val="subscript"/>
-        </w:rPr>
-        <w:t>k+1</w:t>
-      </w:r>
-      <w:r>
-        <w:t xml:space="preserve"> = y</w:t>
+          <w:lang w:val="fr-CA"/>
+        </w:rPr>
+        <w:t>+1</w:t>
+      </w:r>
+      <w:r>
+        <w:rPr>
+          <w:lang w:val="fr-CA"/>
+        </w:rPr>
+        <w:t xml:space="preserve"> = 1 + </w:t>
+      </w:r>
+      <w:proofErr w:type="spellStart"/>
+      <w:r>
+        <w:rPr>
+          <w:lang w:val="fr-CA"/>
+        </w:rPr>
+        <w:t>x</w:t>
       </w:r>
       <w:r>
         <w:rPr>
           <w:vertAlign w:val="subscript"/>
+          <w:lang w:val="fr-CA"/>
         </w:rPr>
         <w:t>k</w:t>
       </w:r>
+      <w:proofErr w:type="spellEnd"/>
     </w:p>
     <w:p>
-      <w:r>
+      <w:pPr>
+        <w:rPr>
+          <w:vertAlign w:val="subscript"/>
+          <w:lang w:val="fr-CA"/>
+        </w:rPr>
+      </w:pPr>
+      <w:r>
+        <w:rPr>
+          <w:vertAlign w:val="subscript"/>
+          <w:lang w:val="fr-CA"/>
+        </w:rPr>
+        <w:t xml:space="preserve"> </w:t>
+      </w:r>
+      <w:r>
+        <w:rPr>
+          <w:lang w:val="fr-CA"/>
+        </w:rPr>
+        <w:t xml:space="preserve">          {</w:t>
+      </w:r>
+      <w:proofErr w:type="gramStart"/>
+      <w:r>
+        <w:rPr>
+          <w:lang w:val="fr-CA"/>
+        </w:rPr>
+        <w:t>y</w:t>
+      </w:r>
+      <w:r>
+        <w:rPr>
+          <w:vertAlign w:val="subscript"/>
+          <w:lang w:val="fr-CA"/>
+        </w:rPr>
+        <w:t>k</w:t>
+      </w:r>
+      <w:proofErr w:type="gramEnd"/>
+      <w:r>
+        <w:rPr>
+          <w:vertAlign w:val="subscript"/>
+          <w:lang w:val="fr-CA"/>
+        </w:rPr>
+        <w:t>+1</w:t>
+      </w:r>
+      <w:r>
+        <w:rPr>
+          <w:lang w:val="fr-CA"/>
+        </w:rPr>
+        <w:t xml:space="preserve"> = </w:t>
+      </w:r>
+      <w:proofErr w:type="spellStart"/>
+      <w:r>
+        <w:rPr>
+          <w:lang w:val="fr-CA"/>
+        </w:rPr>
+        <w:t>y</w:t>
+      </w:r>
+      <w:r>
+        <w:rPr>
+          <w:vertAlign w:val="subscript"/>
+          <w:lang w:val="fr-CA"/>
+        </w:rPr>
+        <w:t>k</w:t>
+      </w:r>
+      <w:proofErr w:type="spellEnd"/>
+    </w:p>
+    <w:p>
+      <w:pPr>
+        <w:rPr>
+          <w:lang w:val="fr-CA"/>
+        </w:rPr>
+      </w:pPr>
+      <w:r>
+        <w:rPr>
+          <w:lang w:val="fr-CA"/>
+        </w:rPr>
         <w:t>P</w:t>
       </w:r>
       <w:r>
         <w:rPr>
           <w:vertAlign w:val="subscript"/>
+          <w:lang w:val="fr-CA"/>
         </w:rPr>
         <w:t>k</w:t>
       </w:r>
       <w:r>
+        <w:rPr>
+          <w:lang w:val="fr-CA"/>
+        </w:rPr>
         <w:t xml:space="preserve"> &gt;= 0 {P</w:t>
       </w:r>
       <w:r>
         <w:rPr>
           <w:vertAlign w:val="subscript"/>
+          <w:lang w:val="fr-CA"/>
         </w:rPr>
         <w:t>k + 1</w:t>
       </w:r>
       <w:r>
+        <w:rPr>
+          <w:lang w:val="fr-CA"/>
+        </w:rPr>
         <w:t xml:space="preserve"> = P</w:t>
       </w:r>
       <w:r>
         <w:rPr>
           <w:vertAlign w:val="subscript"/>
+          <w:lang w:val="fr-CA"/>
         </w:rPr>
         <w:t>k</w:t>
       </w:r>
       <w:r>
+        <w:rPr>
+          <w:lang w:val="fr-CA"/>
+        </w:rPr>
         <w:t xml:space="preserve"> + 2</w:t>
       </w:r>
       <m:oMath>
@@ -1310,6 +1572,9 @@
         </m:r>
       </m:oMath>
       <w:r>
+        <w:rPr>
+          <w:lang w:val="fr-CA"/>
+        </w:rPr>
         <w:t>y - 2</w:t>
       </w:r>
       <m:oMath>
@@ -1321,21 +1586,34 @@
         </m:r>
       </m:oMath>
       <w:r>
+        <w:rPr>
+          <w:lang w:val="fr-CA"/>
+        </w:rPr>
         <w:t>x</w:t>
       </w:r>
     </w:p>
     <w:p>
       <w:r>
+        <w:rPr>
+          <w:lang w:val="fr-CA"/>
+        </w:rPr>
         <w:t xml:space="preserve">         </w:t>
       </w:r>
       <w:r>
         <w:rPr>
           <w:vertAlign w:val="subscript"/>
+          <w:lang w:val="fr-CA"/>
         </w:rPr>
         <w:t xml:space="preserve"> </w:t>
       </w:r>
       <w:r>
-        <w:t xml:space="preserve">   {x</w:t>
+        <w:rPr>
+          <w:lang w:val="fr-CA"/>
+        </w:rPr>
+        <w:t xml:space="preserve">   </w:t>
+      </w:r>
+      <w:r>
+        <w:t>{x</w:t>
       </w:r>
       <w:r>
         <w:rPr>
@@ -1344,7 +1622,11 @@
         <w:t>k+1</w:t>
       </w:r>
       <w:r>
-        <w:t xml:space="preserve"> = 1 + x</w:t>
+        <w:t xml:space="preserve"> = 1 + </w:t>
+      </w:r>
+      <w:proofErr w:type="spellStart"/>
+      <w:r>
+        <w:t>x</w:t>
       </w:r>
       <w:r>
         <w:rPr>
@@ -1352,6 +1634,7 @@
         </w:rPr>
         <w:t>k</w:t>
       </w:r>
+      <w:proofErr w:type="spellEnd"/>
     </w:p>
     <w:p>
       <w:r>
@@ -1370,7 +1653,11 @@
         <w:t>k+1</w:t>
       </w:r>
       <w:r>
-        <w:t xml:space="preserve"> = 1 + y</w:t>
+        <w:t xml:space="preserve"> = 1 + </w:t>
+      </w:r>
+      <w:proofErr w:type="spellStart"/>
+      <w:r>
+        <w:t>y</w:t>
       </w:r>
       <w:r>
         <w:rPr>
@@ -1378,6 +1665,7 @@
         </w:rPr>
         <w:t>k</w:t>
       </w:r>
+      <w:proofErr w:type="spellEnd"/>
     </w:p>
     <w:p/>
     <w:tbl>
@@ -1440,6 +1728,7 @@
               <w:widowControl w:val="0"/>
               <w:spacing w:line="240" w:lineRule="auto"/>
             </w:pPr>
+            <w:proofErr w:type="spellStart"/>
             <w:r>
               <w:t>x</w:t>
             </w:r>
@@ -1449,6 +1738,7 @@
               </w:rPr>
               <w:t>n</w:t>
             </w:r>
+            <w:proofErr w:type="spellEnd"/>
           </w:p>
         </w:tc>
         <w:tc>
@@ -1470,6 +1760,7 @@
                 <w:vertAlign w:val="subscript"/>
               </w:rPr>
             </w:pPr>
+            <w:proofErr w:type="spellStart"/>
             <w:r>
               <w:t>y</w:t>
             </w:r>
@@ -1479,6 +1770,7 @@
               </w:rPr>
               <w:t>n</w:t>
             </w:r>
+            <w:proofErr w:type="spellEnd"/>
           </w:p>
         </w:tc>
         <w:tc>
@@ -2291,167 +2583,86 @@
       </w:r>
     </w:p>
     <w:p/>
+    <w:p/>
     <w:p>
       <w:r>
-        <w:t>3.</w:t>
+        <w:lastRenderedPageBreak/>
+        <w:t>PEA Paragraph</w:t>
+      </w:r>
+    </w:p>
+    <w:p>
+      <w:r>
+        <w:t xml:space="preserve">In the second chart I used the </w:t>
+      </w:r>
+      <w:proofErr w:type="spellStart"/>
+      <w:r>
+        <w:t>Bresenham</w:t>
+      </w:r>
+      <w:proofErr w:type="spellEnd"/>
+      <w:r>
+        <w:t xml:space="preserve"> line drawing algorithm. Some of the advantages I found with this algorithm is that it is </w:t>
+      </w:r>
+      <w:r>
+        <w:t xml:space="preserve">easy to implement because it only uses integer calculations and the points generated are accurate. This algorithm also has some disadvantages as well. The lines generated are not smooth, this algorithm ignores anti-aliasing which is </w:t>
+      </w:r>
+      <w:r>
+        <w:t>supposed to</w:t>
+      </w:r>
+      <w:r>
+        <w:t xml:space="preserve"> smooth jagged lines in digital i</w:t>
+      </w:r>
+      <w:r>
+        <w:t>mage</w:t>
+      </w:r>
+      <w:r>
+        <w:t>s.</w:t>
+      </w:r>
+      <w:r>
+        <w:t xml:space="preserve"> </w:t>
+      </w:r>
+      <w:r>
+        <w:t xml:space="preserve">I learned more about the </w:t>
+      </w:r>
+      <w:proofErr w:type="spellStart"/>
+      <w:r>
+        <w:t>Bresenham</w:t>
+      </w:r>
+      <w:proofErr w:type="spellEnd"/>
+      <w:r>
+        <w:t xml:space="preserve"> algorithm because I had to go and learn it on my own and at my own pace. Then we reviewed in class made sure I understood the algorithm, but I did enjoy this take on learning. At the same </w:t>
+      </w:r>
+      <w:proofErr w:type="gramStart"/>
+      <w:r>
+        <w:t>time</w:t>
+      </w:r>
+      <w:proofErr w:type="gramEnd"/>
+      <w:r>
+        <w:t xml:space="preserve"> I fe</w:t>
+      </w:r>
+      <w:r>
+        <w:t>l</w:t>
+      </w:r>
+      <w:r>
+        <w:t>l down some rabbit holes while researching so in the end I learned even more than expected which was really nice for a change.</w:t>
       </w:r>
     </w:p>
     <w:p/>
     <w:p>
       <w:r>
-        <w:t>Some advantages are:</w:t>
-      </w:r>
-    </w:p>
-    <w:p>
-      <w:pPr>
-        <w:numPr>
-          <w:ilvl w:val="0"/>
-          <w:numId w:val="1"/>
-        </w:numPr>
-      </w:pPr>
-      <w:r>
-        <w:t>The ease of implementation</w:t>
-      </w:r>
-    </w:p>
-    <w:p>
-      <w:pPr>
-        <w:numPr>
-          <w:ilvl w:val="0"/>
-          <w:numId w:val="1"/>
-        </w:numPr>
-      </w:pPr>
-      <w:r>
-        <w:t>The accuracy of the points generated</w:t>
-      </w:r>
-    </w:p>
-    <w:p>
-      <w:pPr>
-        <w:numPr>
-          <w:ilvl w:val="0"/>
-          <w:numId w:val="1"/>
-        </w:numPr>
-      </w:pPr>
-      <w:r>
-        <w:t>Only uses integer calculations</w:t>
-      </w:r>
-    </w:p>
-    <w:p>
-      <w:r>
-        <w:t>4.</w:t>
-      </w:r>
-    </w:p>
-    <w:p/>
-    <w:p>
-      <w:r>
-        <w:t>Some disadvantages of this algorithm are:</w:t>
-      </w:r>
-    </w:p>
-    <w:p>
-      <w:pPr>
-        <w:numPr>
-          <w:ilvl w:val="0"/>
-          <w:numId w:val="2"/>
-        </w:numPr>
-      </w:pPr>
-      <w:r>
-        <w:t>The line generated is not a smooth line</w:t>
-      </w:r>
-    </w:p>
-    <w:p>
-      <w:pPr>
-        <w:numPr>
-          <w:ilvl w:val="0"/>
-          <w:numId w:val="2"/>
-        </w:numPr>
-      </w:pPr>
-      <w:r>
-        <w:t>Best for simple lines</w:t>
-      </w:r>
-    </w:p>
-    <w:p>
-      <w:pPr>
-        <w:numPr>
-          <w:ilvl w:val="0"/>
-          <w:numId w:val="2"/>
-        </w:numPr>
-      </w:pPr>
-      <w:r>
-        <w:t>It ignores anti-aliasing*</w:t>
-      </w:r>
-    </w:p>
-    <w:p>
-      <w:r>
-        <w:t>*Anti-aliasing: The smoothing of jagged edges in digital images.</w:t>
-      </w:r>
-    </w:p>
-    <w:p/>
-    <w:p>
-      <w:r>
-        <w:t>5.</w:t>
-      </w:r>
-    </w:p>
-    <w:p/>
-    <w:p>
-      <w:r>
-        <w:t xml:space="preserve">In my case this hand-in was </w:t>
-      </w:r>
-      <w:proofErr w:type="gramStart"/>
-      <w:r>
-        <w:t>pretty simple</w:t>
-      </w:r>
-      <w:proofErr w:type="gramEnd"/>
-      <w:r>
-        <w:t xml:space="preserve">, I did not have much trouble figuring out the new algorithm. I like the fact that you made us learn it by ourselves, I feel like this way there is more thinking involved. It is not just following your instructions and repeating, so I feel I have a greater understanding of how this algorithm works and when it should be used because by researching it </w:t>
-      </w:r>
-      <w:proofErr w:type="gramStart"/>
-      <w:r>
-        <w:t>online</w:t>
-      </w:r>
-      <w:proofErr w:type="gramEnd"/>
-      <w:r>
-        <w:t xml:space="preserve"> I fell down some rabbit holes and this made me acquire more knowledge on the matter which did not happen with the DDA algorithm we learned in class.</w:t>
-      </w:r>
-    </w:p>
-    <w:p/>
-    <w:p>
-      <w:r>
-        <w:t>6.</w:t>
-      </w:r>
-    </w:p>
-    <w:p/>
-    <w:p>
-      <w:r>
-        <w:t>A field of computer science that uses these types of algorithms and computer graphics is an animator, in my case a 2D animator. A 2D animator is a developer in graphic images that simulates a movement by using frames, all of this in 2D space.</w:t>
-      </w:r>
-    </w:p>
-    <w:p/>
-    <w:p>
-      <w:r>
-        <w:t>7.</w:t>
-      </w:r>
-    </w:p>
-    <w:p/>
-    <w:p>
+        <w:t xml:space="preserve">I also found a field of computer science that uses these types of algorithms and computer graphics is an animator, in my case a 2D animator. A 2D animator is a developer in graphic images that simulates a movement by using frames, all of this in 2D space. </w:t>
+      </w:r>
       <w:r>
         <w:t>Line drawing algorithms are used by the program the 2D animator uses to create the lines he draws on his device. Better line drawing algorithms are required, because of the need for beautiful lines and smooth edges in their animations.</w:t>
       </w:r>
-    </w:p>
-    <w:p/>
-    <w:p>
-      <w:r>
-        <w:t>8.</w:t>
-      </w:r>
-    </w:p>
-    <w:p/>
-    <w:p>
+      <w:r>
+        <w:t xml:space="preserve"> </w:t>
+      </w:r>
       <w:r>
         <w:t xml:space="preserve">For </w:t>
       </w:r>
-      <w:proofErr w:type="gramStart"/>
-      <w:r>
-        <w:t>example</w:t>
-      </w:r>
-      <w:proofErr w:type="gramEnd"/>
+      <w:r>
+        <w:t>example,</w:t>
+      </w:r>
       <w:r>
         <w:t xml:space="preserve"> some line drawing algorithms are used by the software a 2D animator working at Aristocrat Technologies Inc uses Unity. A program that deals with 3D and 2D graphics. Line drawing algorithms are used to generate the lines and shapes created by the animators.</w:t>
       </w:r>
@@ -2461,12 +2672,20 @@
     <w:p/>
     <w:p/>
     <w:p/>
-    <w:p>
-      <w:r>
-        <w:lastRenderedPageBreak/>
-        <w:t>9.</w:t>
-      </w:r>
-    </w:p>
+    <w:p/>
+    <w:p/>
+    <w:p/>
+    <w:p/>
+    <w:p/>
+    <w:p/>
+    <w:p/>
+    <w:p/>
+    <w:p/>
+    <w:p/>
+    <w:p/>
+    <w:p/>
+    <w:p/>
+    <w:p/>
     <w:p/>
     <w:p>
       <w:r>

</xml_diff>